<commit_message>
Updated MySQL schema and Word documentation
</commit_message>
<xml_diff>
--- a/CMS-ProjectDocument.docx
+++ b/CMS-ProjectDocument.docx
@@ -31,17 +31,8 @@
           <w:sz w:val="56"/>
           <w:szCs w:val="56"/>
         </w:rPr>
-        <w:t xml:space="preserve">By </w:t>
+        <w:t>By SleeplessSheep</w:t>
       </w:r>
-      <w:proofErr w:type="spellStart"/>
-      <w:r>
-        <w:rPr>
-          <w:sz w:val="56"/>
-          <w:szCs w:val="56"/>
-        </w:rPr>
-        <w:t>SleeplessSheep</w:t>
-      </w:r>
-      <w:proofErr w:type="spellEnd"/>
     </w:p>
     <w:p>
       <w:pPr>
@@ -53,10 +44,7 @@
     </w:p>
     <w:p>
       <w:r>
-        <w:t>CMS(Content Management System) with LAMP</w:t>
-      </w:r>
-      <w:r>
-        <w:t xml:space="preserve"> is made up of self-practice in web development, namely improve database(and query) design, frontend design and program structure. Furthermore, I would like to explore docker, web security and some APIs.</w:t>
+        <w:t>CMS(Content Management System) with LAMP is made up of self-practice in web development, namely improve database(and query) design, frontend design and program structure. Furthermore, I would like to explore docker, web security and some APIs.</w:t>
       </w:r>
     </w:p>
     <w:p>
@@ -69,6 +57,9 @@
     </w:p>
     <w:p>
       <w:r>
+        <w:rPr>
+          <w:noProof/>
+        </w:rPr>
         <w:drawing>
           <wp:inline distT="0" distB="0" distL="0" distR="0" wp14:anchorId="6F2061ED" wp14:editId="02732F91">
             <wp:extent cx="5274310" cy="3118485"/>
@@ -85,7 +76,7 @@
                     <pic:cNvPicPr/>
                   </pic:nvPicPr>
                   <pic:blipFill>
-                    <a:blip r:embed="rId7"/>
+                    <a:blip r:embed="rId8"/>
                     <a:stretch>
                       <a:fillRect/>
                     </a:stretch>
@@ -190,6 +181,1657 @@
         <w:t>Database Design</w:t>
       </w:r>
     </w:p>
+    <w:p>
+      <w:r>
+        <w:t xml:space="preserve">CMS’s Database contain 7 tables: </w:t>
+      </w:r>
+    </w:p>
+    <w:p>
+      <w:pPr>
+        <w:pStyle w:val="a9"/>
+        <w:numPr>
+          <w:ilvl w:val="0"/>
+          <w:numId w:val="1"/>
+        </w:numPr>
+        <w:ind w:leftChars="0"/>
+      </w:pPr>
+      <w:r>
+        <w:t>post</w:t>
+      </w:r>
+    </w:p>
+    <w:tbl>
+      <w:tblPr>
+        <w:tblStyle w:val="af6"/>
+        <w:tblW w:w="9351" w:type="dxa"/>
+        <w:tblLook w:val="04A0" w:firstRow="1" w:lastRow="0" w:firstColumn="1" w:lastColumn="0" w:noHBand="0" w:noVBand="1"/>
+      </w:tblPr>
+      <w:tblGrid>
+        <w:gridCol w:w="1659"/>
+        <w:gridCol w:w="1659"/>
+        <w:gridCol w:w="1659"/>
+        <w:gridCol w:w="4374"/>
+      </w:tblGrid>
+      <w:tr>
+        <w:tc>
+          <w:tcPr>
+            <w:tcW w:w="1659" w:type="dxa"/>
+          </w:tcPr>
+          <w:p>
+            <w:r>
+              <w:t>Field</w:t>
+            </w:r>
+          </w:p>
+        </w:tc>
+        <w:tc>
+          <w:tcPr>
+            <w:tcW w:w="1659" w:type="dxa"/>
+          </w:tcPr>
+          <w:p>
+            <w:r>
+              <w:t>Type</w:t>
+            </w:r>
+          </w:p>
+        </w:tc>
+        <w:tc>
+          <w:tcPr>
+            <w:tcW w:w="1659" w:type="dxa"/>
+          </w:tcPr>
+          <w:p>
+            <w:r>
+              <w:t>Null</w:t>
+            </w:r>
+          </w:p>
+        </w:tc>
+        <w:tc>
+          <w:tcPr>
+            <w:tcW w:w="4374" w:type="dxa"/>
+          </w:tcPr>
+          <w:p>
+            <w:r>
+              <w:t>Description</w:t>
+            </w:r>
+          </w:p>
+        </w:tc>
+      </w:tr>
+      <w:tr>
+        <w:tc>
+          <w:tcPr>
+            <w:tcW w:w="1659" w:type="dxa"/>
+          </w:tcPr>
+          <w:p>
+            <w:r>
+              <w:t>id</w:t>
+            </w:r>
+          </w:p>
+        </w:tc>
+        <w:tc>
+          <w:tcPr>
+            <w:tcW w:w="1659" w:type="dxa"/>
+          </w:tcPr>
+          <w:p>
+            <w:r>
+              <w:t>Int</w:t>
+            </w:r>
+          </w:p>
+        </w:tc>
+        <w:tc>
+          <w:tcPr>
+            <w:tcW w:w="1659" w:type="dxa"/>
+          </w:tcPr>
+          <w:p>
+            <w:r>
+              <w:t>No</w:t>
+            </w:r>
+          </w:p>
+        </w:tc>
+        <w:tc>
+          <w:tcPr>
+            <w:tcW w:w="4374" w:type="dxa"/>
+          </w:tcPr>
+          <w:p>
+            <w:r>
+              <w:t>The id of the post. Primary key, auto_increment</w:t>
+            </w:r>
+          </w:p>
+        </w:tc>
+      </w:tr>
+      <w:tr>
+        <w:tc>
+          <w:tcPr>
+            <w:tcW w:w="1659" w:type="dxa"/>
+          </w:tcPr>
+          <w:p>
+            <w:r>
+              <w:t>title</w:t>
+            </w:r>
+          </w:p>
+        </w:tc>
+        <w:tc>
+          <w:tcPr>
+            <w:tcW w:w="1659" w:type="dxa"/>
+          </w:tcPr>
+          <w:p>
+            <w:r>
+              <w:t>Varchar(255)</w:t>
+            </w:r>
+          </w:p>
+        </w:tc>
+        <w:tc>
+          <w:tcPr>
+            <w:tcW w:w="1659" w:type="dxa"/>
+          </w:tcPr>
+          <w:p>
+            <w:r>
+              <w:t>No</w:t>
+            </w:r>
+          </w:p>
+        </w:tc>
+        <w:tc>
+          <w:tcPr>
+            <w:tcW w:w="4374" w:type="dxa"/>
+          </w:tcPr>
+          <w:p>
+            <w:r>
+              <w:t>The title of the post, can be used as search/filter function</w:t>
+            </w:r>
+          </w:p>
+        </w:tc>
+      </w:tr>
+      <w:tr>
+        <w:tc>
+          <w:tcPr>
+            <w:tcW w:w="1659" w:type="dxa"/>
+          </w:tcPr>
+          <w:p>
+            <w:r>
+              <w:t>content</w:t>
+            </w:r>
+          </w:p>
+        </w:tc>
+        <w:tc>
+          <w:tcPr>
+            <w:tcW w:w="1659" w:type="dxa"/>
+          </w:tcPr>
+          <w:p>
+            <w:r>
+              <w:t>Test</w:t>
+            </w:r>
+          </w:p>
+        </w:tc>
+        <w:tc>
+          <w:tcPr>
+            <w:tcW w:w="1659" w:type="dxa"/>
+          </w:tcPr>
+          <w:p>
+            <w:r>
+              <w:t>No</w:t>
+            </w:r>
+          </w:p>
+        </w:tc>
+        <w:tc>
+          <w:tcPr>
+            <w:tcW w:w="4374" w:type="dxa"/>
+          </w:tcPr>
+          <w:p>
+            <w:r>
+              <w:t>The text content of the post</w:t>
+            </w:r>
+          </w:p>
+        </w:tc>
+      </w:tr>
+      <w:tr>
+        <w:tc>
+          <w:tcPr>
+            <w:tcW w:w="1659" w:type="dxa"/>
+          </w:tcPr>
+          <w:p>
+            <w:r>
+              <w:t>user_id</w:t>
+            </w:r>
+          </w:p>
+        </w:tc>
+        <w:tc>
+          <w:tcPr>
+            <w:tcW w:w="1659" w:type="dxa"/>
+          </w:tcPr>
+          <w:p>
+            <w:r>
+              <w:t>Int</w:t>
+            </w:r>
+          </w:p>
+        </w:tc>
+        <w:tc>
+          <w:tcPr>
+            <w:tcW w:w="1659" w:type="dxa"/>
+          </w:tcPr>
+          <w:p>
+            <w:r>
+              <w:t>Yes</w:t>
+            </w:r>
+          </w:p>
+        </w:tc>
+        <w:tc>
+          <w:tcPr>
+            <w:tcW w:w="4374" w:type="dxa"/>
+          </w:tcPr>
+          <w:p>
+            <w:r>
+              <w:t>The owner of the post</w:t>
+            </w:r>
+          </w:p>
+        </w:tc>
+      </w:tr>
+      <w:tr>
+        <w:tc>
+          <w:tcPr>
+            <w:tcW w:w="1659" w:type="dxa"/>
+          </w:tcPr>
+          <w:p>
+            <w:r>
+              <w:t>Category_id</w:t>
+            </w:r>
+          </w:p>
+        </w:tc>
+        <w:tc>
+          <w:tcPr>
+            <w:tcW w:w="1659" w:type="dxa"/>
+          </w:tcPr>
+          <w:p>
+            <w:r>
+              <w:t>Int</w:t>
+            </w:r>
+          </w:p>
+        </w:tc>
+        <w:tc>
+          <w:tcPr>
+            <w:tcW w:w="1659" w:type="dxa"/>
+          </w:tcPr>
+          <w:p>
+            <w:r>
+              <w:t>Yes</w:t>
+            </w:r>
+          </w:p>
+        </w:tc>
+        <w:tc>
+          <w:tcPr>
+            <w:tcW w:w="4374" w:type="dxa"/>
+          </w:tcPr>
+          <w:p>
+            <w:r>
+              <w:t>The category reference id</w:t>
+            </w:r>
+          </w:p>
+        </w:tc>
+      </w:tr>
+      <w:tr>
+        <w:tc>
+          <w:tcPr>
+            <w:tcW w:w="1659" w:type="dxa"/>
+          </w:tcPr>
+          <w:p>
+            <w:r>
+              <w:t>created_at</w:t>
+            </w:r>
+          </w:p>
+        </w:tc>
+        <w:tc>
+          <w:tcPr>
+            <w:tcW w:w="1659" w:type="dxa"/>
+          </w:tcPr>
+          <w:p>
+            <w:r>
+              <w:t>Timestamp</w:t>
+            </w:r>
+          </w:p>
+        </w:tc>
+        <w:tc>
+          <w:tcPr>
+            <w:tcW w:w="1659" w:type="dxa"/>
+          </w:tcPr>
+          <w:p>
+            <w:r>
+              <w:t>Yes</w:t>
+            </w:r>
+          </w:p>
+        </w:tc>
+        <w:tc>
+          <w:tcPr>
+            <w:tcW w:w="4374" w:type="dxa"/>
+          </w:tcPr>
+          <w:p>
+            <w:r>
+              <w:t>The created time stamp</w:t>
+            </w:r>
+          </w:p>
+        </w:tc>
+      </w:tr>
+      <w:tr>
+        <w:tc>
+          <w:tcPr>
+            <w:tcW w:w="1659" w:type="dxa"/>
+          </w:tcPr>
+          <w:p>
+            <w:r>
+              <w:t>Updated_at</w:t>
+            </w:r>
+          </w:p>
+        </w:tc>
+        <w:tc>
+          <w:tcPr>
+            <w:tcW w:w="1659" w:type="dxa"/>
+          </w:tcPr>
+          <w:p>
+            <w:r>
+              <w:t>timestamp</w:t>
+            </w:r>
+          </w:p>
+        </w:tc>
+        <w:tc>
+          <w:tcPr>
+            <w:tcW w:w="1659" w:type="dxa"/>
+          </w:tcPr>
+          <w:p>
+            <w:r>
+              <w:t>yes</w:t>
+            </w:r>
+          </w:p>
+        </w:tc>
+        <w:tc>
+          <w:tcPr>
+            <w:tcW w:w="4374" w:type="dxa"/>
+          </w:tcPr>
+          <w:p>
+            <w:r>
+              <w:t>The last update time stamp</w:t>
+            </w:r>
+          </w:p>
+        </w:tc>
+      </w:tr>
+    </w:tbl>
+    <w:p/>
+    <w:p>
+      <w:pPr>
+        <w:pStyle w:val="a9"/>
+        <w:numPr>
+          <w:ilvl w:val="0"/>
+          <w:numId w:val="1"/>
+        </w:numPr>
+        <w:ind w:leftChars="0"/>
+      </w:pPr>
+      <w:r>
+        <w:t>post_images</w:t>
+      </w:r>
+    </w:p>
+    <w:tbl>
+      <w:tblPr>
+        <w:tblStyle w:val="af6"/>
+        <w:tblW w:w="9351" w:type="dxa"/>
+        <w:tblLook w:val="04A0" w:firstRow="1" w:lastRow="0" w:firstColumn="1" w:lastColumn="0" w:noHBand="0" w:noVBand="1"/>
+      </w:tblPr>
+      <w:tblGrid>
+        <w:gridCol w:w="1659"/>
+        <w:gridCol w:w="1659"/>
+        <w:gridCol w:w="1659"/>
+        <w:gridCol w:w="4374"/>
+      </w:tblGrid>
+      <w:tr>
+        <w:tc>
+          <w:tcPr>
+            <w:tcW w:w="1659" w:type="dxa"/>
+          </w:tcPr>
+          <w:p>
+            <w:r>
+              <w:t>Field</w:t>
+            </w:r>
+          </w:p>
+        </w:tc>
+        <w:tc>
+          <w:tcPr>
+            <w:tcW w:w="1659" w:type="dxa"/>
+          </w:tcPr>
+          <w:p>
+            <w:r>
+              <w:t>Type</w:t>
+            </w:r>
+          </w:p>
+        </w:tc>
+        <w:tc>
+          <w:tcPr>
+            <w:tcW w:w="1659" w:type="dxa"/>
+          </w:tcPr>
+          <w:p>
+            <w:r>
+              <w:t>Null</w:t>
+            </w:r>
+          </w:p>
+        </w:tc>
+        <w:tc>
+          <w:tcPr>
+            <w:tcW w:w="4374" w:type="dxa"/>
+          </w:tcPr>
+          <w:p>
+            <w:r>
+              <w:t>Description</w:t>
+            </w:r>
+          </w:p>
+        </w:tc>
+      </w:tr>
+      <w:tr>
+        <w:tc>
+          <w:tcPr>
+            <w:tcW w:w="1659" w:type="dxa"/>
+          </w:tcPr>
+          <w:p>
+            <w:r>
+              <w:lastRenderedPageBreak/>
+              <w:t>Id</w:t>
+            </w:r>
+          </w:p>
+        </w:tc>
+        <w:tc>
+          <w:tcPr>
+            <w:tcW w:w="1659" w:type="dxa"/>
+          </w:tcPr>
+          <w:p>
+            <w:r>
+              <w:t>Int</w:t>
+            </w:r>
+          </w:p>
+        </w:tc>
+        <w:tc>
+          <w:tcPr>
+            <w:tcW w:w="1659" w:type="dxa"/>
+          </w:tcPr>
+          <w:p>
+            <w:r>
+              <w:t>No</w:t>
+            </w:r>
+          </w:p>
+        </w:tc>
+        <w:tc>
+          <w:tcPr>
+            <w:tcW w:w="4374" w:type="dxa"/>
+          </w:tcPr>
+          <w:p>
+            <w:r>
+              <w:t xml:space="preserve">The id of image. </w:t>
+            </w:r>
+            <w:r>
+              <w:t>Primary key, auto_increment</w:t>
+            </w:r>
+          </w:p>
+        </w:tc>
+      </w:tr>
+      <w:tr>
+        <w:tc>
+          <w:tcPr>
+            <w:tcW w:w="1659" w:type="dxa"/>
+          </w:tcPr>
+          <w:p>
+            <w:r>
+              <w:t>Post_id</w:t>
+            </w:r>
+          </w:p>
+        </w:tc>
+        <w:tc>
+          <w:tcPr>
+            <w:tcW w:w="1659" w:type="dxa"/>
+          </w:tcPr>
+          <w:p>
+            <w:r>
+              <w:t>Int</w:t>
+            </w:r>
+          </w:p>
+        </w:tc>
+        <w:tc>
+          <w:tcPr>
+            <w:tcW w:w="1659" w:type="dxa"/>
+          </w:tcPr>
+          <w:p>
+            <w:r>
+              <w:t>Yes</w:t>
+            </w:r>
+          </w:p>
+        </w:tc>
+        <w:tc>
+          <w:tcPr>
+            <w:tcW w:w="4374" w:type="dxa"/>
+          </w:tcPr>
+          <w:p>
+            <w:r>
+              <w:t>The id of the post which have this image</w:t>
+            </w:r>
+          </w:p>
+        </w:tc>
+      </w:tr>
+      <w:tr>
+        <w:tc>
+          <w:tcPr>
+            <w:tcW w:w="1659" w:type="dxa"/>
+          </w:tcPr>
+          <w:p>
+            <w:r>
+              <w:t>Image_url</w:t>
+            </w:r>
+          </w:p>
+        </w:tc>
+        <w:tc>
+          <w:tcPr>
+            <w:tcW w:w="1659" w:type="dxa"/>
+          </w:tcPr>
+          <w:p>
+            <w:r>
+              <w:t>Varchar(255)</w:t>
+            </w:r>
+          </w:p>
+        </w:tc>
+        <w:tc>
+          <w:tcPr>
+            <w:tcW w:w="1659" w:type="dxa"/>
+          </w:tcPr>
+          <w:p>
+            <w:r>
+              <w:t>No</w:t>
+            </w:r>
+          </w:p>
+        </w:tc>
+        <w:tc>
+          <w:tcPr>
+            <w:tcW w:w="4374" w:type="dxa"/>
+          </w:tcPr>
+          <w:p>
+            <w:r>
+              <w:t>The path to the image</w:t>
+            </w:r>
+          </w:p>
+        </w:tc>
+      </w:tr>
+    </w:tbl>
+    <w:p/>
+    <w:p>
+      <w:pPr>
+        <w:pStyle w:val="a9"/>
+        <w:numPr>
+          <w:ilvl w:val="0"/>
+          <w:numId w:val="1"/>
+        </w:numPr>
+        <w:ind w:leftChars="0"/>
+      </w:pPr>
+      <w:r>
+        <w:t>post_tags</w:t>
+      </w:r>
+    </w:p>
+    <w:tbl>
+      <w:tblPr>
+        <w:tblStyle w:val="af6"/>
+        <w:tblW w:w="9351" w:type="dxa"/>
+        <w:tblLook w:val="04A0" w:firstRow="1" w:lastRow="0" w:firstColumn="1" w:lastColumn="0" w:noHBand="0" w:noVBand="1"/>
+      </w:tblPr>
+      <w:tblGrid>
+        <w:gridCol w:w="1659"/>
+        <w:gridCol w:w="1659"/>
+        <w:gridCol w:w="1659"/>
+        <w:gridCol w:w="4374"/>
+      </w:tblGrid>
+      <w:tr>
+        <w:tc>
+          <w:tcPr>
+            <w:tcW w:w="1659" w:type="dxa"/>
+          </w:tcPr>
+          <w:p>
+            <w:r>
+              <w:t>Field</w:t>
+            </w:r>
+          </w:p>
+        </w:tc>
+        <w:tc>
+          <w:tcPr>
+            <w:tcW w:w="1659" w:type="dxa"/>
+          </w:tcPr>
+          <w:p>
+            <w:r>
+              <w:t>Type</w:t>
+            </w:r>
+          </w:p>
+        </w:tc>
+        <w:tc>
+          <w:tcPr>
+            <w:tcW w:w="1659" w:type="dxa"/>
+          </w:tcPr>
+          <w:p>
+            <w:r>
+              <w:t>Null</w:t>
+            </w:r>
+          </w:p>
+        </w:tc>
+        <w:tc>
+          <w:tcPr>
+            <w:tcW w:w="4374" w:type="dxa"/>
+          </w:tcPr>
+          <w:p>
+            <w:r>
+              <w:t>Description</w:t>
+            </w:r>
+          </w:p>
+        </w:tc>
+      </w:tr>
+      <w:tr>
+        <w:tc>
+          <w:tcPr>
+            <w:tcW w:w="1659" w:type="dxa"/>
+          </w:tcPr>
+          <w:p>
+            <w:r>
+              <w:t>Post_id</w:t>
+            </w:r>
+          </w:p>
+        </w:tc>
+        <w:tc>
+          <w:tcPr>
+            <w:tcW w:w="1659" w:type="dxa"/>
+          </w:tcPr>
+          <w:p>
+            <w:r>
+              <w:t>int</w:t>
+            </w:r>
+          </w:p>
+        </w:tc>
+        <w:tc>
+          <w:tcPr>
+            <w:tcW w:w="1659" w:type="dxa"/>
+          </w:tcPr>
+          <w:p>
+            <w:r>
+              <w:t>no</w:t>
+            </w:r>
+          </w:p>
+        </w:tc>
+        <w:tc>
+          <w:tcPr>
+            <w:tcW w:w="4374" w:type="dxa"/>
+          </w:tcPr>
+          <w:p>
+            <w:r>
+              <w:t>The id of the post</w:t>
+            </w:r>
+          </w:p>
+        </w:tc>
+      </w:tr>
+      <w:tr>
+        <w:tc>
+          <w:tcPr>
+            <w:tcW w:w="1659" w:type="dxa"/>
+          </w:tcPr>
+          <w:p>
+            <w:r>
+              <w:t>Tag_id</w:t>
+            </w:r>
+          </w:p>
+        </w:tc>
+        <w:tc>
+          <w:tcPr>
+            <w:tcW w:w="1659" w:type="dxa"/>
+          </w:tcPr>
+          <w:p>
+            <w:r>
+              <w:t>Int</w:t>
+            </w:r>
+          </w:p>
+        </w:tc>
+        <w:tc>
+          <w:tcPr>
+            <w:tcW w:w="1659" w:type="dxa"/>
+          </w:tcPr>
+          <w:p>
+            <w:r>
+              <w:t>no</w:t>
+            </w:r>
+          </w:p>
+        </w:tc>
+        <w:tc>
+          <w:tcPr>
+            <w:tcW w:w="4374" w:type="dxa"/>
+          </w:tcPr>
+          <w:p>
+            <w:r>
+              <w:t>The id of the tag</w:t>
+            </w:r>
+          </w:p>
+        </w:tc>
+      </w:tr>
+    </w:tbl>
+    <w:p>
+      <w:pPr>
+        <w:pStyle w:val="a9"/>
+        <w:ind w:leftChars="0"/>
+      </w:pPr>
+    </w:p>
+    <w:p>
+      <w:pPr>
+        <w:pStyle w:val="a9"/>
+        <w:numPr>
+          <w:ilvl w:val="0"/>
+          <w:numId w:val="1"/>
+        </w:numPr>
+        <w:ind w:leftChars="0"/>
+      </w:pPr>
+      <w:r>
+        <w:t>tags</w:t>
+      </w:r>
+    </w:p>
+    <w:tbl>
+      <w:tblPr>
+        <w:tblStyle w:val="af6"/>
+        <w:tblW w:w="9351" w:type="dxa"/>
+        <w:tblLook w:val="04A0" w:firstRow="1" w:lastRow="0" w:firstColumn="1" w:lastColumn="0" w:noHBand="0" w:noVBand="1"/>
+      </w:tblPr>
+      <w:tblGrid>
+        <w:gridCol w:w="1659"/>
+        <w:gridCol w:w="1659"/>
+        <w:gridCol w:w="1659"/>
+        <w:gridCol w:w="4374"/>
+      </w:tblGrid>
+      <w:tr>
+        <w:tc>
+          <w:tcPr>
+            <w:tcW w:w="1659" w:type="dxa"/>
+          </w:tcPr>
+          <w:p>
+            <w:r>
+              <w:t>Field</w:t>
+            </w:r>
+          </w:p>
+        </w:tc>
+        <w:tc>
+          <w:tcPr>
+            <w:tcW w:w="1659" w:type="dxa"/>
+          </w:tcPr>
+          <w:p>
+            <w:r>
+              <w:t>Type</w:t>
+            </w:r>
+          </w:p>
+        </w:tc>
+        <w:tc>
+          <w:tcPr>
+            <w:tcW w:w="1659" w:type="dxa"/>
+          </w:tcPr>
+          <w:p>
+            <w:r>
+              <w:t>Null</w:t>
+            </w:r>
+          </w:p>
+        </w:tc>
+        <w:tc>
+          <w:tcPr>
+            <w:tcW w:w="4374" w:type="dxa"/>
+          </w:tcPr>
+          <w:p>
+            <w:r>
+              <w:t>Description</w:t>
+            </w:r>
+          </w:p>
+        </w:tc>
+      </w:tr>
+      <w:tr>
+        <w:tc>
+          <w:tcPr>
+            <w:tcW w:w="1659" w:type="dxa"/>
+          </w:tcPr>
+          <w:p>
+            <w:r>
+              <w:t>id</w:t>
+            </w:r>
+          </w:p>
+        </w:tc>
+        <w:tc>
+          <w:tcPr>
+            <w:tcW w:w="1659" w:type="dxa"/>
+          </w:tcPr>
+          <w:p>
+            <w:r>
+              <w:t>int</w:t>
+            </w:r>
+          </w:p>
+        </w:tc>
+        <w:tc>
+          <w:tcPr>
+            <w:tcW w:w="1659" w:type="dxa"/>
+          </w:tcPr>
+          <w:p>
+            <w:r>
+              <w:t>No</w:t>
+            </w:r>
+          </w:p>
+        </w:tc>
+        <w:tc>
+          <w:tcPr>
+            <w:tcW w:w="4374" w:type="dxa"/>
+          </w:tcPr>
+          <w:p>
+            <w:r>
+              <w:t>The id of the tag</w:t>
+            </w:r>
+          </w:p>
+        </w:tc>
+      </w:tr>
+      <w:tr>
+        <w:tc>
+          <w:tcPr>
+            <w:tcW w:w="1659" w:type="dxa"/>
+          </w:tcPr>
+          <w:p>
+            <w:r>
+              <w:t>name</w:t>
+            </w:r>
+          </w:p>
+        </w:tc>
+        <w:tc>
+          <w:tcPr>
+            <w:tcW w:w="1659" w:type="dxa"/>
+          </w:tcPr>
+          <w:p>
+            <w:r>
+              <w:t>Varchar(50)</w:t>
+            </w:r>
+          </w:p>
+        </w:tc>
+        <w:tc>
+          <w:tcPr>
+            <w:tcW w:w="1659" w:type="dxa"/>
+          </w:tcPr>
+          <w:p>
+            <w:r>
+              <w:t>No</w:t>
+            </w:r>
+          </w:p>
+        </w:tc>
+        <w:tc>
+          <w:tcPr>
+            <w:tcW w:w="4374" w:type="dxa"/>
+          </w:tcPr>
+          <w:p>
+            <w:r>
+              <w:t>The name of the tag</w:t>
+            </w:r>
+          </w:p>
+        </w:tc>
+      </w:tr>
+    </w:tbl>
+    <w:p>
+      <w:pPr>
+        <w:pStyle w:val="a9"/>
+        <w:ind w:leftChars="0"/>
+      </w:pPr>
+    </w:p>
+    <w:p>
+      <w:pPr>
+        <w:pStyle w:val="a9"/>
+        <w:numPr>
+          <w:ilvl w:val="0"/>
+          <w:numId w:val="1"/>
+        </w:numPr>
+        <w:ind w:leftChars="0"/>
+      </w:pPr>
+      <w:r>
+        <w:t>comments</w:t>
+      </w:r>
+    </w:p>
+    <w:tbl>
+      <w:tblPr>
+        <w:tblStyle w:val="af6"/>
+        <w:tblW w:w="9351" w:type="dxa"/>
+        <w:tblLook w:val="04A0" w:firstRow="1" w:lastRow="0" w:firstColumn="1" w:lastColumn="0" w:noHBand="0" w:noVBand="1"/>
+      </w:tblPr>
+      <w:tblGrid>
+        <w:gridCol w:w="1659"/>
+        <w:gridCol w:w="1659"/>
+        <w:gridCol w:w="1659"/>
+        <w:gridCol w:w="4374"/>
+      </w:tblGrid>
+      <w:tr>
+        <w:tc>
+          <w:tcPr>
+            <w:tcW w:w="1659" w:type="dxa"/>
+          </w:tcPr>
+          <w:p>
+            <w:r>
+              <w:t>Field</w:t>
+            </w:r>
+          </w:p>
+        </w:tc>
+        <w:tc>
+          <w:tcPr>
+            <w:tcW w:w="1659" w:type="dxa"/>
+          </w:tcPr>
+          <w:p>
+            <w:r>
+              <w:t>Type</w:t>
+            </w:r>
+          </w:p>
+        </w:tc>
+        <w:tc>
+          <w:tcPr>
+            <w:tcW w:w="1659" w:type="dxa"/>
+          </w:tcPr>
+          <w:p>
+            <w:r>
+              <w:t>Null</w:t>
+            </w:r>
+          </w:p>
+        </w:tc>
+        <w:tc>
+          <w:tcPr>
+            <w:tcW w:w="4374" w:type="dxa"/>
+          </w:tcPr>
+          <w:p>
+            <w:r>
+              <w:t>Description</w:t>
+            </w:r>
+          </w:p>
+        </w:tc>
+      </w:tr>
+      <w:tr>
+        <w:tc>
+          <w:tcPr>
+            <w:tcW w:w="1659" w:type="dxa"/>
+          </w:tcPr>
+          <w:p>
+            <w:r>
+              <w:t>Id</w:t>
+            </w:r>
+          </w:p>
+        </w:tc>
+        <w:tc>
+          <w:tcPr>
+            <w:tcW w:w="1659" w:type="dxa"/>
+          </w:tcPr>
+          <w:p>
+            <w:r>
+              <w:t>int</w:t>
+            </w:r>
+          </w:p>
+        </w:tc>
+        <w:tc>
+          <w:tcPr>
+            <w:tcW w:w="1659" w:type="dxa"/>
+          </w:tcPr>
+          <w:p>
+            <w:r>
+              <w:t>No</w:t>
+            </w:r>
+          </w:p>
+        </w:tc>
+        <w:tc>
+          <w:tcPr>
+            <w:tcW w:w="4374" w:type="dxa"/>
+          </w:tcPr>
+          <w:p>
+            <w:r>
+              <w:t>The id of the comment</w:t>
+            </w:r>
+          </w:p>
+        </w:tc>
+      </w:tr>
+      <w:tr>
+        <w:tc>
+          <w:tcPr>
+            <w:tcW w:w="1659" w:type="dxa"/>
+          </w:tcPr>
+          <w:p>
+            <w:r>
+              <w:t>Post_id</w:t>
+            </w:r>
+          </w:p>
+        </w:tc>
+        <w:tc>
+          <w:tcPr>
+            <w:tcW w:w="1659" w:type="dxa"/>
+          </w:tcPr>
+          <w:p>
+            <w:r>
+              <w:t>Int</w:t>
+            </w:r>
+          </w:p>
+        </w:tc>
+        <w:tc>
+          <w:tcPr>
+            <w:tcW w:w="1659" w:type="dxa"/>
+          </w:tcPr>
+          <w:p>
+            <w:r>
+              <w:t>Yes</w:t>
+            </w:r>
+          </w:p>
+        </w:tc>
+        <w:tc>
+          <w:tcPr>
+            <w:tcW w:w="4374" w:type="dxa"/>
+          </w:tcPr>
+          <w:p>
+            <w:r>
+              <w:t>The post_id of the post</w:t>
+            </w:r>
+          </w:p>
+        </w:tc>
+      </w:tr>
+      <w:tr>
+        <w:tc>
+          <w:tcPr>
+            <w:tcW w:w="1659" w:type="dxa"/>
+          </w:tcPr>
+          <w:p>
+            <w:r>
+              <w:t>User_id</w:t>
+            </w:r>
+          </w:p>
+        </w:tc>
+        <w:tc>
+          <w:tcPr>
+            <w:tcW w:w="1659" w:type="dxa"/>
+          </w:tcPr>
+          <w:p>
+            <w:r>
+              <w:t>Int</w:t>
+            </w:r>
+          </w:p>
+        </w:tc>
+        <w:tc>
+          <w:tcPr>
+            <w:tcW w:w="1659" w:type="dxa"/>
+          </w:tcPr>
+          <w:p>
+            <w:r>
+              <w:t>Yes</w:t>
+            </w:r>
+          </w:p>
+        </w:tc>
+        <w:tc>
+          <w:tcPr>
+            <w:tcW w:w="4374" w:type="dxa"/>
+          </w:tcPr>
+          <w:p>
+            <w:r>
+              <w:t>The user_id of the comment owner</w:t>
+            </w:r>
+          </w:p>
+        </w:tc>
+      </w:tr>
+      <w:tr>
+        <w:tc>
+          <w:tcPr>
+            <w:tcW w:w="1659" w:type="dxa"/>
+          </w:tcPr>
+          <w:p>
+            <w:r>
+              <w:t>Content</w:t>
+            </w:r>
+          </w:p>
+        </w:tc>
+        <w:tc>
+          <w:tcPr>
+            <w:tcW w:w="1659" w:type="dxa"/>
+          </w:tcPr>
+          <w:p>
+            <w:r>
+              <w:t>Text</w:t>
+            </w:r>
+          </w:p>
+        </w:tc>
+        <w:tc>
+          <w:tcPr>
+            <w:tcW w:w="1659" w:type="dxa"/>
+          </w:tcPr>
+          <w:p>
+            <w:r>
+              <w:t>No</w:t>
+            </w:r>
+          </w:p>
+        </w:tc>
+        <w:tc>
+          <w:tcPr>
+            <w:tcW w:w="4374" w:type="dxa"/>
+          </w:tcPr>
+          <w:p>
+            <w:r>
+              <w:t>The text content of the comment</w:t>
+            </w:r>
+          </w:p>
+        </w:tc>
+      </w:tr>
+      <w:tr>
+        <w:tc>
+          <w:tcPr>
+            <w:tcW w:w="1659" w:type="dxa"/>
+          </w:tcPr>
+          <w:p>
+            <w:r>
+              <w:t>Created_at</w:t>
+            </w:r>
+          </w:p>
+        </w:tc>
+        <w:tc>
+          <w:tcPr>
+            <w:tcW w:w="1659" w:type="dxa"/>
+          </w:tcPr>
+          <w:p>
+            <w:r>
+              <w:t>Timestamp</w:t>
+            </w:r>
+          </w:p>
+        </w:tc>
+        <w:tc>
+          <w:tcPr>
+            <w:tcW w:w="1659" w:type="dxa"/>
+          </w:tcPr>
+          <w:p>
+            <w:r>
+              <w:t>Yes</w:t>
+            </w:r>
+          </w:p>
+        </w:tc>
+        <w:tc>
+          <w:tcPr>
+            <w:tcW w:w="4374" w:type="dxa"/>
+          </w:tcPr>
+          <w:p>
+            <w:r>
+              <w:t>The timestamp when create this comment</w:t>
+            </w:r>
+          </w:p>
+        </w:tc>
+      </w:tr>
+    </w:tbl>
+    <w:p/>
+    <w:p>
+      <w:pPr>
+        <w:pStyle w:val="a9"/>
+        <w:numPr>
+          <w:ilvl w:val="0"/>
+          <w:numId w:val="1"/>
+        </w:numPr>
+        <w:ind w:leftChars="0"/>
+      </w:pPr>
+      <w:r>
+        <w:t>categories</w:t>
+      </w:r>
+    </w:p>
+    <w:tbl>
+      <w:tblPr>
+        <w:tblStyle w:val="af6"/>
+        <w:tblW w:w="9351" w:type="dxa"/>
+        <w:tblLook w:val="04A0" w:firstRow="1" w:lastRow="0" w:firstColumn="1" w:lastColumn="0" w:noHBand="0" w:noVBand="1"/>
+      </w:tblPr>
+      <w:tblGrid>
+        <w:gridCol w:w="1659"/>
+        <w:gridCol w:w="1659"/>
+        <w:gridCol w:w="1659"/>
+        <w:gridCol w:w="4374"/>
+      </w:tblGrid>
+      <w:tr>
+        <w:tc>
+          <w:tcPr>
+            <w:tcW w:w="1659" w:type="dxa"/>
+          </w:tcPr>
+          <w:p>
+            <w:r>
+              <w:t>Field</w:t>
+            </w:r>
+          </w:p>
+        </w:tc>
+        <w:tc>
+          <w:tcPr>
+            <w:tcW w:w="1659" w:type="dxa"/>
+          </w:tcPr>
+          <w:p>
+            <w:r>
+              <w:t>Type</w:t>
+            </w:r>
+          </w:p>
+        </w:tc>
+        <w:tc>
+          <w:tcPr>
+            <w:tcW w:w="1659" w:type="dxa"/>
+          </w:tcPr>
+          <w:p>
+            <w:r>
+              <w:t>Null</w:t>
+            </w:r>
+          </w:p>
+        </w:tc>
+        <w:tc>
+          <w:tcPr>
+            <w:tcW w:w="4374" w:type="dxa"/>
+          </w:tcPr>
+          <w:p>
+            <w:r>
+              <w:t>Description</w:t>
+            </w:r>
+          </w:p>
+        </w:tc>
+      </w:tr>
+      <w:tr>
+        <w:tc>
+          <w:tcPr>
+            <w:tcW w:w="1659" w:type="dxa"/>
+          </w:tcPr>
+          <w:p>
+            <w:r>
+              <w:t>Id</w:t>
+            </w:r>
+          </w:p>
+        </w:tc>
+        <w:tc>
+          <w:tcPr>
+            <w:tcW w:w="1659" w:type="dxa"/>
+          </w:tcPr>
+          <w:p>
+            <w:r>
+              <w:t>int</w:t>
+            </w:r>
+          </w:p>
+        </w:tc>
+        <w:tc>
+          <w:tcPr>
+            <w:tcW w:w="1659" w:type="dxa"/>
+          </w:tcPr>
+          <w:p>
+            <w:r>
+              <w:t>No</w:t>
+            </w:r>
+          </w:p>
+        </w:tc>
+        <w:tc>
+          <w:tcPr>
+            <w:tcW w:w="4374" w:type="dxa"/>
+          </w:tcPr>
+          <w:p>
+            <w:r>
+              <w:t>The id of the categories</w:t>
+            </w:r>
+          </w:p>
+        </w:tc>
+      </w:tr>
+      <w:tr>
+        <w:tc>
+          <w:tcPr>
+            <w:tcW w:w="1659" w:type="dxa"/>
+          </w:tcPr>
+          <w:p>
+            <w:r>
+              <w:t>name</w:t>
+            </w:r>
+          </w:p>
+        </w:tc>
+        <w:tc>
+          <w:tcPr>
+            <w:tcW w:w="1659" w:type="dxa"/>
+          </w:tcPr>
+          <w:p>
+            <w:r>
+              <w:t>Varchar(100)</w:t>
+            </w:r>
+          </w:p>
+        </w:tc>
+        <w:tc>
+          <w:tcPr>
+            <w:tcW w:w="1659" w:type="dxa"/>
+          </w:tcPr>
+          <w:p>
+            <w:r>
+              <w:t>No</w:t>
+            </w:r>
+          </w:p>
+        </w:tc>
+        <w:tc>
+          <w:tcPr>
+            <w:tcW w:w="4374" w:type="dxa"/>
+          </w:tcPr>
+          <w:p>
+            <w:r>
+              <w:t>The name of the categories</w:t>
+            </w:r>
+          </w:p>
+        </w:tc>
+      </w:tr>
+    </w:tbl>
+    <w:p/>
+    <w:p>
+      <w:pPr>
+        <w:pStyle w:val="a9"/>
+        <w:numPr>
+          <w:ilvl w:val="0"/>
+          <w:numId w:val="1"/>
+        </w:numPr>
+        <w:ind w:leftChars="0"/>
+      </w:pPr>
+      <w:r>
+        <w:t>users</w:t>
+      </w:r>
+    </w:p>
+    <w:tbl>
+      <w:tblPr>
+        <w:tblStyle w:val="af6"/>
+        <w:tblW w:w="9351" w:type="dxa"/>
+        <w:tblLook w:val="04A0" w:firstRow="1" w:lastRow="0" w:firstColumn="1" w:lastColumn="0" w:noHBand="0" w:noVBand="1"/>
+      </w:tblPr>
+      <w:tblGrid>
+        <w:gridCol w:w="1855"/>
+        <w:gridCol w:w="3935"/>
+        <w:gridCol w:w="1027"/>
+        <w:gridCol w:w="2534"/>
+      </w:tblGrid>
+      <w:tr>
+        <w:tc>
+          <w:tcPr>
+            <w:tcW w:w="1659" w:type="dxa"/>
+          </w:tcPr>
+          <w:p>
+            <w:r>
+              <w:t>Field</w:t>
+            </w:r>
+          </w:p>
+        </w:tc>
+        <w:tc>
+          <w:tcPr>
+            <w:tcW w:w="1659" w:type="dxa"/>
+          </w:tcPr>
+          <w:p>
+            <w:r>
+              <w:t>Type</w:t>
+            </w:r>
+          </w:p>
+        </w:tc>
+        <w:tc>
+          <w:tcPr>
+            <w:tcW w:w="1659" w:type="dxa"/>
+          </w:tcPr>
+          <w:p>
+            <w:r>
+              <w:t>Null</w:t>
+            </w:r>
+          </w:p>
+        </w:tc>
+        <w:tc>
+          <w:tcPr>
+            <w:tcW w:w="4374" w:type="dxa"/>
+          </w:tcPr>
+          <w:p>
+            <w:r>
+              <w:t>Description</w:t>
+            </w:r>
+          </w:p>
+        </w:tc>
+      </w:tr>
+      <w:tr>
+        <w:tc>
+          <w:tcPr>
+            <w:tcW w:w="1659" w:type="dxa"/>
+          </w:tcPr>
+          <w:p>
+            <w:r>
+              <w:t>id</w:t>
+            </w:r>
+          </w:p>
+        </w:tc>
+        <w:tc>
+          <w:tcPr>
+            <w:tcW w:w="1659" w:type="dxa"/>
+          </w:tcPr>
+          <w:p>
+            <w:r>
+              <w:t>int</w:t>
+            </w:r>
+          </w:p>
+        </w:tc>
+        <w:tc>
+          <w:tcPr>
+            <w:tcW w:w="1659" w:type="dxa"/>
+          </w:tcPr>
+          <w:p>
+            <w:r>
+              <w:t>no</w:t>
+            </w:r>
+          </w:p>
+        </w:tc>
+        <w:tc>
+          <w:tcPr>
+            <w:tcW w:w="4374" w:type="dxa"/>
+          </w:tcPr>
+          <w:p>
+            <w:r>
+              <w:t>The id of the user</w:t>
+            </w:r>
+          </w:p>
+        </w:tc>
+      </w:tr>
+      <w:tr>
+        <w:tc>
+          <w:tcPr>
+            <w:tcW w:w="1659" w:type="dxa"/>
+          </w:tcPr>
+          <w:p>
+            <w:r>
+              <w:lastRenderedPageBreak/>
+              <w:t>username</w:t>
+            </w:r>
+          </w:p>
+        </w:tc>
+        <w:tc>
+          <w:tcPr>
+            <w:tcW w:w="1659" w:type="dxa"/>
+          </w:tcPr>
+          <w:p>
+            <w:r>
+              <w:t>Varchar(50)</w:t>
+            </w:r>
+          </w:p>
+        </w:tc>
+        <w:tc>
+          <w:tcPr>
+            <w:tcW w:w="1659" w:type="dxa"/>
+          </w:tcPr>
+          <w:p>
+            <w:r>
+              <w:t>no</w:t>
+            </w:r>
+          </w:p>
+        </w:tc>
+        <w:tc>
+          <w:tcPr>
+            <w:tcW w:w="4374" w:type="dxa"/>
+          </w:tcPr>
+          <w:p>
+            <w:r>
+              <w:t>The username of the user account</w:t>
+            </w:r>
+          </w:p>
+        </w:tc>
+      </w:tr>
+      <w:tr>
+        <w:tc>
+          <w:tcPr>
+            <w:tcW w:w="1659" w:type="dxa"/>
+          </w:tcPr>
+          <w:p>
+            <w:r>
+              <w:t>email</w:t>
+            </w:r>
+          </w:p>
+        </w:tc>
+        <w:tc>
+          <w:tcPr>
+            <w:tcW w:w="1659" w:type="dxa"/>
+          </w:tcPr>
+          <w:p>
+            <w:r>
+              <w:t>Varchar(100)</w:t>
+            </w:r>
+          </w:p>
+        </w:tc>
+        <w:tc>
+          <w:tcPr>
+            <w:tcW w:w="1659" w:type="dxa"/>
+          </w:tcPr>
+          <w:p>
+            <w:r>
+              <w:t>no</w:t>
+            </w:r>
+          </w:p>
+        </w:tc>
+        <w:tc>
+          <w:tcPr>
+            <w:tcW w:w="4374" w:type="dxa"/>
+          </w:tcPr>
+          <w:p>
+            <w:r>
+              <w:t>The email address of the user account</w:t>
+            </w:r>
+          </w:p>
+        </w:tc>
+      </w:tr>
+      <w:tr>
+        <w:tc>
+          <w:tcPr>
+            <w:tcW w:w="1659" w:type="dxa"/>
+          </w:tcPr>
+          <w:p>
+            <w:r>
+              <w:t>Password_hash</w:t>
+            </w:r>
+          </w:p>
+        </w:tc>
+        <w:tc>
+          <w:tcPr>
+            <w:tcW w:w="1659" w:type="dxa"/>
+          </w:tcPr>
+          <w:p>
+            <w:r>
+              <w:t>Varchar(255)</w:t>
+            </w:r>
+          </w:p>
+        </w:tc>
+        <w:tc>
+          <w:tcPr>
+            <w:tcW w:w="1659" w:type="dxa"/>
+          </w:tcPr>
+          <w:p>
+            <w:r>
+              <w:t>no</w:t>
+            </w:r>
+          </w:p>
+        </w:tc>
+        <w:tc>
+          <w:tcPr>
+            <w:tcW w:w="4374" w:type="dxa"/>
+          </w:tcPr>
+          <w:p>
+            <w:r>
+              <w:t>The hashed password of the user account. It been salted and even admin can not view the password</w:t>
+            </w:r>
+          </w:p>
+        </w:tc>
+      </w:tr>
+      <w:tr>
+        <w:tc>
+          <w:tcPr>
+            <w:tcW w:w="1659" w:type="dxa"/>
+          </w:tcPr>
+          <w:p>
+            <w:r>
+              <w:t>role</w:t>
+            </w:r>
+          </w:p>
+        </w:tc>
+        <w:tc>
+          <w:tcPr>
+            <w:tcW w:w="1659" w:type="dxa"/>
+          </w:tcPr>
+          <w:p>
+            <w:r>
+              <w:t>Enum(‘admin’,’author’,’subscriber’)</w:t>
+            </w:r>
+          </w:p>
+        </w:tc>
+        <w:tc>
+          <w:tcPr>
+            <w:tcW w:w="1659" w:type="dxa"/>
+          </w:tcPr>
+          <w:p>
+            <w:r>
+              <w:t>Yes</w:t>
+            </w:r>
+          </w:p>
+        </w:tc>
+        <w:tc>
+          <w:tcPr>
+            <w:tcW w:w="4374" w:type="dxa"/>
+          </w:tcPr>
+          <w:p>
+            <w:r>
+              <w:t>The role of the user account.</w:t>
+            </w:r>
+          </w:p>
+          <w:p>
+            <w:r>
+              <w:t>Admin can delete post</w:t>
+            </w:r>
+          </w:p>
+          <w:p>
+            <w:r>
+              <w:t>Author can create post</w:t>
+            </w:r>
+          </w:p>
+          <w:p>
+            <w:r>
+              <w:t>Subscriber can read post and leave comment</w:t>
+            </w:r>
+          </w:p>
+        </w:tc>
+      </w:tr>
+      <w:tr>
+        <w:tc>
+          <w:tcPr>
+            <w:tcW w:w="1659" w:type="dxa"/>
+          </w:tcPr>
+          <w:p>
+            <w:r>
+              <w:t>Created_at</w:t>
+            </w:r>
+          </w:p>
+        </w:tc>
+        <w:tc>
+          <w:tcPr>
+            <w:tcW w:w="1659" w:type="dxa"/>
+          </w:tcPr>
+          <w:p>
+            <w:r>
+              <w:t>timestamp</w:t>
+            </w:r>
+          </w:p>
+        </w:tc>
+        <w:tc>
+          <w:tcPr>
+            <w:tcW w:w="1659" w:type="dxa"/>
+          </w:tcPr>
+          <w:p>
+            <w:r>
+              <w:t>Yes</w:t>
+            </w:r>
+          </w:p>
+        </w:tc>
+        <w:tc>
+          <w:tcPr>
+            <w:tcW w:w="4374" w:type="dxa"/>
+          </w:tcPr>
+          <w:p>
+            <w:r>
+              <w:t>The timestamp of account creation</w:t>
+            </w:r>
+          </w:p>
+        </w:tc>
+      </w:tr>
+    </w:tbl>
     <w:p/>
     <w:p>
       <w:pPr>
@@ -209,6 +1851,100 @@
     </w:sectPr>
   </w:body>
 </w:document>
+</file>
+
+<file path=word/numbering.xml><?xml version="1.0" encoding="utf-8"?>
+<w:numbering xmlns:wpc="http://schemas.microsoft.com/office/word/2010/wordprocessingCanvas" xmlns:cx="http://schemas.microsoft.com/office/drawing/2014/chartex" xmlns:cx1="http://schemas.microsoft.com/office/drawing/2015/9/8/chartex" xmlns:cx2="http://schemas.microsoft.com/office/drawing/2015/10/21/chartex" xmlns:cx3="http://schemas.microsoft.com/office/drawing/2016/5/9/chartex" xmlns:cx4="http://schemas.microsoft.com/office/drawing/2016/5/10/chartex" xmlns:cx5="http://schemas.microsoft.com/office/drawing/2016/5/11/chartex" xmlns:cx6="http://schemas.microsoft.com/office/drawing/2016/5/12/chartex" xmlns:cx7="http://schemas.microsoft.com/office/drawing/2016/5/13/chartex" xmlns:cx8="http://schemas.microsoft.com/office/drawing/2016/5/14/chartex" xmlns:mc="http://schemas.openxmlformats.org/markup-compatibility/2006" xmlns:aink="http://schemas.microsoft.com/office/drawing/2016/ink" xmlns:am3d="http://schemas.microsoft.com/office/drawing/2017/model3d" xmlns:o="urn:schemas-microsoft-com:office:office" xmlns:oel="http://schemas.microsoft.com/office/2019/extlst" xmlns:r="http://schemas.openxmlformats.org/officeDocument/2006/relationships" xmlns:m="http://schemas.openxmlformats.org/officeDocument/2006/math" xmlns:v="urn:schemas-microsoft-com:vml" xmlns:wp14="http://schemas.microsoft.com/office/word/2010/wordprocessingDrawing" xmlns:wp="http://schemas.openxmlformats.org/drawingml/2006/wordprocessingDrawing" xmlns:w10="urn:schemas-microsoft-com:office:word" xmlns:w="http://schemas.openxmlformats.org/wordprocessingml/2006/main" xmlns:w14="http://schemas.microsoft.com/office/word/2010/wordml" xmlns:w15="http://schemas.microsoft.com/office/word/2012/wordml" xmlns:w16cex="http://schemas.microsoft.com/office/word/2018/wordml/cex" xmlns:w16cid="http://schemas.microsoft.com/office/word/2016/wordml/cid" xmlns:w16="http://schemas.microsoft.com/office/word/2018/wordml" xmlns:w16du="http://schemas.microsoft.com/office/word/2023/wordml/word16du" xmlns:w16sdtdh="http://schemas.microsoft.com/office/word/2020/wordml/sdtdatahash" xmlns:w16sdtfl="http://schemas.microsoft.com/office/word/2024/wordml/sdtformatlock" xmlns:w16se="http://schemas.microsoft.com/office/word/2015/wordml/symex" xmlns:wpg="http://schemas.microsoft.com/office/word/2010/wordprocessingGroup" xmlns:wpi="http://schemas.microsoft.com/office/word/2010/wordprocessingInk" xmlns:wne="http://schemas.microsoft.com/office/word/2006/wordml" xmlns:wps="http://schemas.microsoft.com/office/word/2010/wordprocessingShape" mc:Ignorable="w14 w15 w16se w16cid w16 w16cex w16sdtdh w16sdtfl w16du wp14">
+  <w:abstractNum w:abstractNumId="0" w15:restartNumberingAfterBreak="0">
+    <w:nsid w:val="34C47B07"/>
+    <w:multiLevelType w:val="hybridMultilevel"/>
+    <w:tmpl w:val="0C521898"/>
+    <w:lvl w:ilvl="0" w:tplc="0409000F">
+      <w:start w:val="1"/>
+      <w:numFmt w:val="decimal"/>
+      <w:lvlText w:val="%1."/>
+      <w:lvlJc w:val="left"/>
+      <w:pPr>
+        <w:ind w:left="480" w:hanging="480"/>
+      </w:pPr>
+    </w:lvl>
+    <w:lvl w:ilvl="1" w:tplc="04090019" w:tentative="1">
+      <w:start w:val="1"/>
+      <w:numFmt w:val="ideographTraditional"/>
+      <w:lvlText w:val="%2、"/>
+      <w:lvlJc w:val="left"/>
+      <w:pPr>
+        <w:ind w:left="960" w:hanging="480"/>
+      </w:pPr>
+    </w:lvl>
+    <w:lvl w:ilvl="2" w:tplc="0409001B" w:tentative="1">
+      <w:start w:val="1"/>
+      <w:numFmt w:val="lowerRoman"/>
+      <w:lvlText w:val="%3."/>
+      <w:lvlJc w:val="right"/>
+      <w:pPr>
+        <w:ind w:left="1440" w:hanging="480"/>
+      </w:pPr>
+    </w:lvl>
+    <w:lvl w:ilvl="3" w:tplc="0409000F" w:tentative="1">
+      <w:start w:val="1"/>
+      <w:numFmt w:val="decimal"/>
+      <w:lvlText w:val="%4."/>
+      <w:lvlJc w:val="left"/>
+      <w:pPr>
+        <w:ind w:left="1920" w:hanging="480"/>
+      </w:pPr>
+    </w:lvl>
+    <w:lvl w:ilvl="4" w:tplc="04090019" w:tentative="1">
+      <w:start w:val="1"/>
+      <w:numFmt w:val="ideographTraditional"/>
+      <w:lvlText w:val="%5、"/>
+      <w:lvlJc w:val="left"/>
+      <w:pPr>
+        <w:ind w:left="2400" w:hanging="480"/>
+      </w:pPr>
+    </w:lvl>
+    <w:lvl w:ilvl="5" w:tplc="0409001B" w:tentative="1">
+      <w:start w:val="1"/>
+      <w:numFmt w:val="lowerRoman"/>
+      <w:lvlText w:val="%6."/>
+      <w:lvlJc w:val="right"/>
+      <w:pPr>
+        <w:ind w:left="2880" w:hanging="480"/>
+      </w:pPr>
+    </w:lvl>
+    <w:lvl w:ilvl="6" w:tplc="0409000F" w:tentative="1">
+      <w:start w:val="1"/>
+      <w:numFmt w:val="decimal"/>
+      <w:lvlText w:val="%7."/>
+      <w:lvlJc w:val="left"/>
+      <w:pPr>
+        <w:ind w:left="3360" w:hanging="480"/>
+      </w:pPr>
+    </w:lvl>
+    <w:lvl w:ilvl="7" w:tplc="04090019" w:tentative="1">
+      <w:start w:val="1"/>
+      <w:numFmt w:val="ideographTraditional"/>
+      <w:lvlText w:val="%8、"/>
+      <w:lvlJc w:val="left"/>
+      <w:pPr>
+        <w:ind w:left="3840" w:hanging="480"/>
+      </w:pPr>
+    </w:lvl>
+    <w:lvl w:ilvl="8" w:tplc="0409001B" w:tentative="1">
+      <w:start w:val="1"/>
+      <w:numFmt w:val="lowerRoman"/>
+      <w:lvlText w:val="%9."/>
+      <w:lvlJc w:val="right"/>
+      <w:pPr>
+        <w:ind w:left="4320" w:hanging="480"/>
+      </w:pPr>
+    </w:lvl>
+  </w:abstractNum>
+  <w:num w:numId="1" w16cid:durableId="226721504">
+    <w:abstractNumId w:val="0"/>
+  </w:num>
+</w:numbering>
 </file>
 
 <file path=word/styles.xml><?xml version="1.0" encoding="utf-8"?>
@@ -609,7 +2345,7 @@
   <w:style w:type="paragraph" w:default="1" w:styleId="a">
     <w:name w:val="Normal"/>
     <w:qFormat/>
-    <w:rsid w:val="00D71411"/>
+    <w:rsid w:val="0034552F"/>
   </w:style>
   <w:style w:type="paragraph" w:styleId="1">
     <w:name w:val="heading 1"/>
@@ -1229,6 +2965,25 @@
       <w:sz w:val="32"/>
       <w:szCs w:val="32"/>
     </w:rPr>
+  </w:style>
+  <w:style w:type="table" w:styleId="af6">
+    <w:name w:val="Table Grid"/>
+    <w:basedOn w:val="a1"/>
+    <w:uiPriority w:val="39"/>
+    <w:rsid w:val="00973829"/>
+    <w:pPr>
+      <w:spacing w:after="0" w:line="240" w:lineRule="auto"/>
+    </w:pPr>
+    <w:tblPr>
+      <w:tblBorders>
+        <w:top w:val="single" w:sz="4" w:space="0" w:color="auto"/>
+        <w:left w:val="single" w:sz="4" w:space="0" w:color="auto"/>
+        <w:bottom w:val="single" w:sz="4" w:space="0" w:color="auto"/>
+        <w:right w:val="single" w:sz="4" w:space="0" w:color="auto"/>
+        <w:insideH w:val="single" w:sz="4" w:space="0" w:color="auto"/>
+        <w:insideV w:val="single" w:sz="4" w:space="0" w:color="auto"/>
+      </w:tblBorders>
+    </w:tblPr>
   </w:style>
 </w:styles>
 </file>
@@ -1529,6 +3284,23 @@
 </file>
 
 <file path=customXml/item1.xml><?xml version="1.0" encoding="utf-8"?>
+<p:properties xmlns:p="http://schemas.microsoft.com/office/2006/metadata/properties" xmlns:xsi="http://www.w3.org/2001/XMLSchema-instance" xmlns:pc="http://schemas.microsoft.com/office/infopath/2007/PartnerControls">
+  <documentManagement>
+    <_activity xmlns="31d916c6-a4bb-4730-bd3b-47008dbf3559" xsi:nil="true"/>
+  </documentManagement>
+</p:properties>
+</file>
+
+<file path=customXml/item2.xml><?xml version="1.0" encoding="utf-8"?>
+<?mso-contentType ?>
+<FormTemplates xmlns="http://schemas.microsoft.com/sharepoint/v3/contenttype/forms">
+  <Display>DocumentLibraryForm</Display>
+  <Edit>DocumentLibraryForm</Edit>
+  <New>DocumentLibraryForm</New>
+</FormTemplates>
+</file>
+
+<file path=customXml/item3.xml><?xml version="1.0" encoding="utf-8"?>
 <ct:contentTypeSchema xmlns:ct="http://schemas.microsoft.com/office/2006/metadata/contentType" xmlns:ma="http://schemas.microsoft.com/office/2006/metadata/properties/metaAttributes" ct:_="" ma:_="" ma:contentTypeName="Document" ma:contentTypeID="0x0101009F5332992D978045BE6AE29F72E78582" ma:contentTypeVersion="13" ma:contentTypeDescription="Create a new document." ma:contentTypeScope="" ma:versionID="21ca74ac023a2725991ae9ef47c872c6">
   <xsd:schema xmlns:xsd="http://www.w3.org/2001/XMLSchema" xmlns:xs="http://www.w3.org/2001/XMLSchema" xmlns:p="http://schemas.microsoft.com/office/2006/metadata/properties" xmlns:ns3="31d916c6-a4bb-4730-bd3b-47008dbf3559" xmlns:ns4="39f1b2ba-7f3c-46e6-b66c-40204fda8f41" targetNamespace="http://schemas.microsoft.com/office/2006/metadata/properties" ma:root="true" ma:fieldsID="dc5b86ae71a639c6912a90687aaee939" ns3:_="" ns4:_="">
     <xsd:import namespace="31d916c6-a4bb-4730-bd3b-47008dbf3559"/>
@@ -1747,24 +3519,25 @@
 </ct:contentTypeSchema>
 </file>
 
-<file path=customXml/item2.xml><?xml version="1.0" encoding="utf-8"?>
-<?mso-contentType ?>
-<FormTemplates xmlns="http://schemas.microsoft.com/sharepoint/v3/contenttype/forms">
-  <Display>DocumentLibraryForm</Display>
-  <Edit>DocumentLibraryForm</Edit>
-  <New>DocumentLibraryForm</New>
-</FormTemplates>
+<file path=customXml/itemProps1.xml><?xml version="1.0" encoding="utf-8"?>
+<ds:datastoreItem xmlns:ds="http://schemas.openxmlformats.org/officeDocument/2006/customXml" ds:itemID="{D32DB1C2-EF5E-470D-9364-A888886A0869}">
+  <ds:schemaRefs>
+    <ds:schemaRef ds:uri="http://schemas.microsoft.com/office/2006/metadata/properties"/>
+    <ds:schemaRef ds:uri="http://schemas.microsoft.com/office/infopath/2007/PartnerControls"/>
+    <ds:schemaRef ds:uri="31d916c6-a4bb-4730-bd3b-47008dbf3559"/>
+  </ds:schemaRefs>
+</ds:datastoreItem>
 </file>
 
-<file path=customXml/item3.xml><?xml version="1.0" encoding="utf-8"?>
-<p:properties xmlns:p="http://schemas.microsoft.com/office/2006/metadata/properties" xmlns:xsi="http://www.w3.org/2001/XMLSchema-instance" xmlns:pc="http://schemas.microsoft.com/office/infopath/2007/PartnerControls">
-  <documentManagement>
-    <_activity xmlns="31d916c6-a4bb-4730-bd3b-47008dbf3559" xsi:nil="true"/>
-  </documentManagement>
-</p:properties>
+<file path=customXml/itemProps2.xml><?xml version="1.0" encoding="utf-8"?>
+<ds:datastoreItem xmlns:ds="http://schemas.openxmlformats.org/officeDocument/2006/customXml" ds:itemID="{37494920-99EE-4648-AFFC-5AE99BFF5F89}">
+  <ds:schemaRefs>
+    <ds:schemaRef ds:uri="http://schemas.microsoft.com/sharepoint/v3/contenttype/forms"/>
+  </ds:schemaRefs>
+</ds:datastoreItem>
 </file>
 
-<file path=customXml/itemProps1.xml><?xml version="1.0" encoding="utf-8"?>
+<file path=customXml/itemProps3.xml><?xml version="1.0" encoding="utf-8"?>
 <ds:datastoreItem xmlns:ds="http://schemas.openxmlformats.org/officeDocument/2006/customXml" ds:itemID="{92312732-9E2A-450D-9991-56E0950FC58F}">
   <ds:schemaRefs>
     <ds:schemaRef ds:uri="http://schemas.microsoft.com/office/2006/metadata/contentType"/>
@@ -1781,29 +3554,4 @@
     <ds:schemaRef ds:uri="http://schemas.microsoft.com/internal/obd"/>
   </ds:schemaRefs>
 </ds:datastoreItem>
-</file>
-
-<file path=customXml/itemProps2.xml><?xml version="1.0" encoding="utf-8"?>
-<ds:datastoreItem xmlns:ds="http://schemas.openxmlformats.org/officeDocument/2006/customXml" ds:itemID="{37494920-99EE-4648-AFFC-5AE99BFF5F89}">
-  <ds:schemaRefs>
-    <ds:schemaRef ds:uri="http://schemas.microsoft.com/sharepoint/v3/contenttype/forms"/>
-  </ds:schemaRefs>
-</ds:datastoreItem>
-</file>
-
-<file path=customXml/itemProps3.xml><?xml version="1.0" encoding="utf-8"?>
-<ds:datastoreItem xmlns:ds="http://schemas.openxmlformats.org/officeDocument/2006/customXml" ds:itemID="{D32DB1C2-EF5E-470D-9364-A888886A0869}">
-  <ds:schemaRefs>
-    <ds:schemaRef ds:uri="http://schemas.microsoft.com/office/2006/documentManagement/types"/>
-    <ds:schemaRef ds:uri="http://schemas.microsoft.com/office/2006/metadata/properties"/>
-    <ds:schemaRef ds:uri="http://schemas.microsoft.com/office/infopath/2007/PartnerControls"/>
-    <ds:schemaRef ds:uri="http://purl.org/dc/elements/1.1/"/>
-    <ds:schemaRef ds:uri="http://www.w3.org/XML/1998/namespace"/>
-    <ds:schemaRef ds:uri="http://purl.org/dc/dcmitype/"/>
-    <ds:schemaRef ds:uri="http://schemas.openxmlformats.org/package/2006/metadata/core-properties"/>
-    <ds:schemaRef ds:uri="39f1b2ba-7f3c-46e6-b66c-40204fda8f41"/>
-    <ds:schemaRef ds:uri="31d916c6-a4bb-4730-bd3b-47008dbf3559"/>
-    <ds:schemaRef ds:uri="http://purl.org/dc/terms/"/>
-  </ds:schemaRefs>
-</ds:datastoreItem>
 </file>
</xml_diff>